<commit_message>
I just made few changes
</commit_message>
<xml_diff>
--- a/ALAB 351-2.docx
+++ b/ALAB 351-2.docx
@@ -4,6 +4,9 @@
   <w:body>
     <w:p>
       <w:r>
+        <w:rPr>
+          <w:noProof/>
+        </w:rPr>
         <w:drawing>
           <wp:inline distT="0" distB="0" distL="0" distR="0" wp14:anchorId="5527EA4E" wp14:editId="00FCF2C0">
             <wp:extent cx="4496190" cy="1615580"/>
@@ -43,6 +46,9 @@
     </w:p>
     <w:p>
       <w:r>
+        <w:rPr>
+          <w:noProof/>
+        </w:rPr>
         <w:drawing>
           <wp:inline distT="0" distB="0" distL="0" distR="0" wp14:anchorId="0896DFCA" wp14:editId="2470B06A">
             <wp:extent cx="5943600" cy="3994785"/>
@@ -79,10 +85,89 @@
           </wp:inline>
         </w:drawing>
       </w:r>
+    </w:p>
+    <w:p>
+      <w:r>
+        <w:lastRenderedPageBreak/>
+        <w:drawing>
+          <wp:inline distT="0" distB="0" distL="0" distR="0" wp14:anchorId="24879CAA" wp14:editId="0191FB54">
+            <wp:extent cx="5852667" cy="7475868"/>
+            <wp:effectExtent l="0" t="0" r="0" b="0"/>
+            <wp:docPr id="2" name="Picture 2"/>
+            <wp:cNvGraphicFramePr>
+              <a:graphicFrameLocks xmlns:a="http://schemas.openxmlformats.org/drawingml/2006/main" noChangeAspect="1"/>
+            </wp:cNvGraphicFramePr>
+            <a:graphic xmlns:a="http://schemas.openxmlformats.org/drawingml/2006/main">
+              <a:graphicData uri="http://schemas.openxmlformats.org/drawingml/2006/picture">
+                <pic:pic xmlns:pic="http://schemas.openxmlformats.org/drawingml/2006/picture">
+                  <pic:nvPicPr>
+                    <pic:cNvPr id="0" name=""/>
+                    <pic:cNvPicPr/>
+                  </pic:nvPicPr>
+                  <pic:blipFill>
+                    <a:blip r:embed="rId7"/>
+                    <a:stretch>
+                      <a:fillRect/>
+                    </a:stretch>
+                  </pic:blipFill>
+                  <pic:spPr>
+                    <a:xfrm>
+                      <a:off x="0" y="0"/>
+                      <a:ext cx="5852667" cy="7475868"/>
+                    </a:xfrm>
+                    <a:prstGeom prst="rect">
+                      <a:avLst/>
+                    </a:prstGeom>
+                  </pic:spPr>
+                </pic:pic>
+              </a:graphicData>
+            </a:graphic>
+          </wp:inline>
+        </w:drawing>
+      </w:r>
+    </w:p>
+    <w:p>
+      <w:r>
+        <w:lastRenderedPageBreak/>
+        <w:drawing>
+          <wp:inline distT="0" distB="0" distL="0" distR="0" wp14:anchorId="15ED92CD" wp14:editId="5AEAE379">
+            <wp:extent cx="5943600" cy="4323715"/>
+            <wp:effectExtent l="0" t="0" r="0" b="635"/>
+            <wp:docPr id="4" name="Picture 4"/>
+            <wp:cNvGraphicFramePr>
+              <a:graphicFrameLocks xmlns:a="http://schemas.openxmlformats.org/drawingml/2006/main" noChangeAspect="1"/>
+            </wp:cNvGraphicFramePr>
+            <a:graphic xmlns:a="http://schemas.openxmlformats.org/drawingml/2006/main">
+              <a:graphicData uri="http://schemas.openxmlformats.org/drawingml/2006/picture">
+                <pic:pic xmlns:pic="http://schemas.openxmlformats.org/drawingml/2006/picture">
+                  <pic:nvPicPr>
+                    <pic:cNvPr id="0" name=""/>
+                    <pic:cNvPicPr/>
+                  </pic:nvPicPr>
+                  <pic:blipFill>
+                    <a:blip r:embed="rId8"/>
+                    <a:stretch>
+                      <a:fillRect/>
+                    </a:stretch>
+                  </pic:blipFill>
+                  <pic:spPr>
+                    <a:xfrm>
+                      <a:off x="0" y="0"/>
+                      <a:ext cx="5943600" cy="4323715"/>
+                    </a:xfrm>
+                    <a:prstGeom prst="rect">
+                      <a:avLst/>
+                    </a:prstGeom>
+                  </pic:spPr>
+                </pic:pic>
+              </a:graphicData>
+            </a:graphic>
+          </wp:inline>
+        </w:drawing>
+      </w:r>
       <w:bookmarkStart w:id="0" w:name="_GoBack"/>
       <w:bookmarkEnd w:id="0"/>
     </w:p>
-    <w:p/>
     <w:sectPr>
       <w:pgSz w:w="12240" w:h="15840"/>
       <w:pgMar w:top="1440" w:right="1440" w:bottom="1440" w:left="1440" w:header="720" w:footer="720" w:gutter="0"/>

</xml_diff>

<commit_message>
Update ALAB 351-2 document
</commit_message>
<xml_diff>
--- a/ALAB 351-2.docx
+++ b/ALAB 351-2.docx
@@ -154,6 +154,46 @@
                     <a:xfrm>
                       <a:off x="0" y="0"/>
                       <a:ext cx="5943600" cy="4323715"/>
+                    </a:xfrm>
+                    <a:prstGeom prst="rect">
+                      <a:avLst/>
+                    </a:prstGeom>
+                  </pic:spPr>
+                </pic:pic>
+              </a:graphicData>
+            </a:graphic>
+          </wp:inline>
+        </w:drawing>
+      </w:r>
+    </w:p>
+    <w:p>
+      <w:r>
+        <w:lastRenderedPageBreak/>
+        <w:drawing>
+          <wp:inline distT="0" distB="0" distL="0" distR="0" wp14:anchorId="6FD27E30" wp14:editId="259645B4">
+            <wp:extent cx="5311600" cy="7361558"/>
+            <wp:effectExtent l="0" t="0" r="3810" b="0"/>
+            <wp:docPr id="5" name="Picture 5"/>
+            <wp:cNvGraphicFramePr>
+              <a:graphicFrameLocks xmlns:a="http://schemas.openxmlformats.org/drawingml/2006/main" noChangeAspect="1"/>
+            </wp:cNvGraphicFramePr>
+            <a:graphic xmlns:a="http://schemas.openxmlformats.org/drawingml/2006/main">
+              <a:graphicData uri="http://schemas.openxmlformats.org/drawingml/2006/picture">
+                <pic:pic xmlns:pic="http://schemas.openxmlformats.org/drawingml/2006/picture">
+                  <pic:nvPicPr>
+                    <pic:cNvPr id="0" name=""/>
+                    <pic:cNvPicPr/>
+                  </pic:nvPicPr>
+                  <pic:blipFill>
+                    <a:blip r:embed="rId9"/>
+                    <a:stretch>
+                      <a:fillRect/>
+                    </a:stretch>
+                  </pic:blipFill>
+                  <pic:spPr>
+                    <a:xfrm>
+                      <a:off x="0" y="0"/>
+                      <a:ext cx="5311600" cy="7361558"/>
                     </a:xfrm>
                     <a:prstGeom prst="rect">
                       <a:avLst/>

</xml_diff>